<commit_message>
docs: add table of contents to production deployment guide
</commit_message>
<xml_diff>
--- a/Digital_Labs_Production_Deployment_Guide.docx
+++ b/Digital_Labs_Production_Deployment_Guide.docx
@@ -770,6 +770,54 @@
       <w:r>
         <w:t xml:space="preserve"/>
       </w:r>
+    </w:p>
+    <w:p>
+      <w:pPr>
+        <w:spacing w:before="240" w:after="120"/>
+        <w:pBdr>
+          <w:bottom w:val="single" w:color="2D36EC" w:sz="6" w:space="4"/>
+        </w:pBdr>
+      </w:pPr>
+      <w:r>
+        <w:rPr>
+          <w:rFonts w:ascii="Arial" w:cs="Arial" w:eastAsia="Arial" w:hAnsi="Arial"/>
+          <w:b/>
+          <w:bCs/>
+          <w:color w:val="090B2F"/>
+          <w:sz w:val="32"/>
+          <w:szCs w:val="32"/>
+        </w:rPr>
+        <w:t xml:space="preserve">Contents</w:t>
+      </w:r>
+    </w:p>
+    <w:p>
+      <w:pPr>
+        <w:spacing w:before="0" w:after="0"/>
+      </w:pPr>
+      <w:r>
+        <w:fldChar w:fldCharType="begin" w:dirty="true"/>
+      </w:r>
+      <w:r>
+        <w:instrText xml:space="preserve"> TOC \o "1-2" \h \z \u </w:instrText>
+      </w:r>
+      <w:r>
+        <w:fldChar w:fldCharType="separate"/>
+      </w:r>
+      <w:r>
+        <w:rPr>
+          <w:rFonts w:ascii="Arial" w:cs="Arial" w:hAnsi="Arial"/>
+          <w:sz w:val="22"/>
+        </w:rPr>
+        <w:t xml:space="preserve">Right-click and choose Update Field to generate the table of contents.</w:t>
+      </w:r>
+      <w:r>
+        <w:fldChar w:fldCharType="end"/>
+      </w:r>
+    </w:p>
+    <w:p>
+      <w:pPr>
+        <w:spacing w:before="120" w:after="0"/>
+      </w:pPr>
     </w:p>
     <w:p>
       <w:r>

</xml_diff>

<commit_message>
docs: pre-populate TOC with all headings — no user action required
</commit_message>
<xml_diff>
--- a/Digital_Labs_Production_Deployment_Guide.docx
+++ b/Digital_Labs_Production_Deployment_Guide.docx
@@ -803,13 +803,1058 @@
       <w:r>
         <w:fldChar w:fldCharType="separate"/>
       </w:r>
-      <w:r>
-        <w:rPr>
-          <w:rFonts w:ascii="Arial" w:cs="Arial" w:hAnsi="Arial"/>
-          <w:sz w:val="22"/>
-        </w:rPr>
-        <w:t xml:space="preserve">Right-click and choose Update Field to generate the table of contents.</w:t>
-      </w:r>
+      <w:p>
+        <w:pPr>
+          <w:spacing w:before="80" w:after="20"/>
+          <w:ind w:left="0"/>
+          <w:tabs>
+            <w:tab w:val="leader" w:leader="dot" w:pos="9000"/>
+          </w:tabs>
+        </w:pPr>
+        <w:r>
+          <w:rPr>
+            <w:rFonts w:ascii="Arial" w:cs="Arial" w:eastAsia="Arial" w:hAnsi="Arial"/>
+            <w:b/>
+            <w:bCs/>
+            <w:color w:val="090B2F"/>
+            <w:sz w:val="22"/>
+            <w:szCs w:val="22"/>
+          </w:rPr>
+          <w:t xml:space="preserve">Overview</w:t>
+        </w:r>
+      </w:p>
+      <w:p>
+        <w:pPr>
+          <w:spacing w:before="20" w:after="20"/>
+          <w:ind w:left="360"/>
+          <w:tabs>
+            <w:tab w:val="leader" w:leader="dot" w:pos="9000"/>
+          </w:tabs>
+        </w:pPr>
+        <w:r>
+          <w:rPr>
+            <w:rFonts w:ascii="Arial" w:cs="Arial" w:eastAsia="Arial" w:hAnsi="Arial"/>
+            <w:color w:val="555555"/>
+            <w:sz w:val="20"/>
+            <w:szCs w:val="20"/>
+          </w:rPr>
+          <w:t xml:space="preserve">What Gets Provisioned</w:t>
+        </w:r>
+      </w:p>
+      <w:p>
+        <w:pPr>
+          <w:spacing w:before="80" w:after="20"/>
+          <w:ind w:left="0"/>
+          <w:tabs>
+            <w:tab w:val="leader" w:leader="dot" w:pos="9000"/>
+          </w:tabs>
+        </w:pPr>
+        <w:r>
+          <w:rPr>
+            <w:rFonts w:ascii="Arial" w:cs="Arial" w:eastAsia="Arial" w:hAnsi="Arial"/>
+            <w:b/>
+            <w:bCs/>
+            <w:color w:val="090B2F"/>
+            <w:sz w:val="22"/>
+            <w:szCs w:val="22"/>
+          </w:rPr>
+          <w:t xml:space="preserve">Prerequisites</w:t>
+        </w:r>
+      </w:p>
+      <w:p>
+        <w:pPr>
+          <w:spacing w:before="20" w:after="20"/>
+          <w:ind w:left="360"/>
+          <w:tabs>
+            <w:tab w:val="leader" w:leader="dot" w:pos="9000"/>
+          </w:tabs>
+        </w:pPr>
+        <w:r>
+          <w:rPr>
+            <w:rFonts w:ascii="Arial" w:cs="Arial" w:eastAsia="Arial" w:hAnsi="Arial"/>
+            <w:color w:val="555555"/>
+            <w:sz w:val="20"/>
+            <w:szCs w:val="20"/>
+          </w:rPr>
+          <w:t xml:space="preserve">Tools (per contributor machine)</w:t>
+        </w:r>
+      </w:p>
+      <w:p>
+        <w:pPr>
+          <w:spacing w:before="20" w:after="20"/>
+          <w:ind w:left="360"/>
+          <w:tabs>
+            <w:tab w:val="leader" w:leader="dot" w:pos="9000"/>
+          </w:tabs>
+        </w:pPr>
+        <w:r>
+          <w:rPr>
+            <w:rFonts w:ascii="Arial" w:cs="Arial" w:eastAsia="Arial" w:hAnsi="Arial"/>
+            <w:color w:val="555555"/>
+            <w:sz w:val="20"/>
+            <w:szCs w:val="20"/>
+          </w:rPr>
+          <w:t xml:space="preserve">AWS Account Access</w:t>
+        </w:r>
+      </w:p>
+      <w:p>
+        <w:pPr>
+          <w:spacing w:before="20" w:after="20"/>
+          <w:ind w:left="360"/>
+          <w:tabs>
+            <w:tab w:val="leader" w:leader="dot" w:pos="9000"/>
+          </w:tabs>
+        </w:pPr>
+        <w:r>
+          <w:rPr>
+            <w:rFonts w:ascii="Arial" w:cs="Arial" w:eastAsia="Arial" w:hAnsi="Arial"/>
+            <w:color w:val="555555"/>
+            <w:sz w:val="20"/>
+            <w:szCs w:val="20"/>
+          </w:rPr>
+          <w:t xml:space="preserve">Anthropic API Access</w:t>
+        </w:r>
+      </w:p>
+      <w:p>
+        <w:pPr>
+          <w:spacing w:before="20" w:after="20"/>
+          <w:ind w:left="360"/>
+          <w:tabs>
+            <w:tab w:val="leader" w:leader="dot" w:pos="9000"/>
+          </w:tabs>
+        </w:pPr>
+        <w:r>
+          <w:rPr>
+            <w:rFonts w:ascii="Arial" w:cs="Arial" w:eastAsia="Arial" w:hAnsi="Arial"/>
+            <w:color w:val="555555"/>
+            <w:sz w:val="20"/>
+            <w:szCs w:val="20"/>
+          </w:rPr>
+          <w:t xml:space="preserve">Sonatype License</w:t>
+        </w:r>
+      </w:p>
+      <w:p>
+        <w:pPr>
+          <w:spacing w:before="80" w:after="20"/>
+          <w:ind w:left="0"/>
+          <w:tabs>
+            <w:tab w:val="leader" w:leader="dot" w:pos="9000"/>
+          </w:tabs>
+        </w:pPr>
+        <w:r>
+          <w:rPr>
+            <w:rFonts w:ascii="Arial" w:cs="Arial" w:eastAsia="Arial" w:hAnsi="Arial"/>
+            <w:b/>
+            <w:bCs/>
+            <w:color w:val="090B2F"/>
+            <w:sz w:val="22"/>
+            <w:szCs w:val="22"/>
+          </w:rPr>
+          <w:t xml:space="preserve">Phase 1 — Transfer the Repository</w:t>
+        </w:r>
+      </w:p>
+      <w:p>
+        <w:pPr>
+          <w:spacing w:before="20" w:after="20"/>
+          <w:ind w:left="360"/>
+          <w:tabs>
+            <w:tab w:val="leader" w:leader="dot" w:pos="9000"/>
+          </w:tabs>
+        </w:pPr>
+        <w:r>
+          <w:rPr>
+            <w:rFonts w:ascii="Arial" w:cs="Arial" w:eastAsia="Arial" w:hAnsi="Arial"/>
+            <w:color w:val="555555"/>
+            <w:sz w:val="20"/>
+            <w:szCs w:val="20"/>
+          </w:rPr>
+          <w:t xml:space="preserve">Option A — GitHub Transfer (recommended)</w:t>
+        </w:r>
+      </w:p>
+      <w:p>
+        <w:pPr>
+          <w:spacing w:before="20" w:after="20"/>
+          <w:ind w:left="360"/>
+          <w:tabs>
+            <w:tab w:val="leader" w:leader="dot" w:pos="9000"/>
+          </w:tabs>
+        </w:pPr>
+        <w:r>
+          <w:rPr>
+            <w:rFonts w:ascii="Arial" w:cs="Arial" w:eastAsia="Arial" w:hAnsi="Arial"/>
+            <w:color w:val="555555"/>
+            <w:sz w:val="20"/>
+            <w:szCs w:val="20"/>
+          </w:rPr>
+          <w:t xml:space="preserve">Option B — Fresh Clone and Push</w:t>
+        </w:r>
+      </w:p>
+      <w:p>
+        <w:pPr>
+          <w:spacing w:before="20" w:after="20"/>
+          <w:ind w:left="360"/>
+          <w:tabs>
+            <w:tab w:val="leader" w:leader="dot" w:pos="9000"/>
+          </w:tabs>
+        </w:pPr>
+        <w:r>
+          <w:rPr>
+            <w:rFonts w:ascii="Arial" w:cs="Arial" w:eastAsia="Arial" w:hAnsi="Arial"/>
+            <w:color w:val="555555"/>
+            <w:sz w:val="20"/>
+            <w:szCs w:val="20"/>
+          </w:rPr>
+          <w:t xml:space="preserve">Add Team Members</w:t>
+        </w:r>
+      </w:p>
+      <w:p>
+        <w:pPr>
+          <w:spacing w:before="80" w:after="20"/>
+          <w:ind w:left="0"/>
+          <w:tabs>
+            <w:tab w:val="leader" w:leader="dot" w:pos="9000"/>
+          </w:tabs>
+        </w:pPr>
+        <w:r>
+          <w:rPr>
+            <w:rFonts w:ascii="Arial" w:cs="Arial" w:eastAsia="Arial" w:hAnsi="Arial"/>
+            <w:b/>
+            <w:bCs/>
+            <w:color w:val="090B2F"/>
+            <w:sz w:val="22"/>
+            <w:szCs w:val="22"/>
+          </w:rPr>
+          <w:t xml:space="preserve">Phase 2 — AWS Account Setup</w:t>
+        </w:r>
+      </w:p>
+      <w:p>
+        <w:pPr>
+          <w:spacing w:before="20" w:after="20"/>
+          <w:ind w:left="360"/>
+          <w:tabs>
+            <w:tab w:val="leader" w:leader="dot" w:pos="9000"/>
+          </w:tabs>
+        </w:pPr>
+        <w:r>
+          <w:rPr>
+            <w:rFonts w:ascii="Arial" w:cs="Arial" w:eastAsia="Arial" w:hAnsi="Arial"/>
+            <w:color w:val="555555"/>
+            <w:sz w:val="20"/>
+            <w:szCs w:val="20"/>
+          </w:rPr>
+          <w:t xml:space="preserve">Step 2.1 — Create an IAM User for Deployments</w:t>
+        </w:r>
+      </w:p>
+      <w:p>
+        <w:pPr>
+          <w:spacing w:before="20" w:after="20"/>
+          <w:ind w:left="360"/>
+          <w:tabs>
+            <w:tab w:val="leader" w:leader="dot" w:pos="9000"/>
+          </w:tabs>
+        </w:pPr>
+        <w:r>
+          <w:rPr>
+            <w:rFonts w:ascii="Arial" w:cs="Arial" w:eastAsia="Arial" w:hAnsi="Arial"/>
+            <w:color w:val="555555"/>
+            <w:sz w:val="20"/>
+            <w:szCs w:val="20"/>
+          </w:rPr>
+          <w:t xml:space="preserve">Step 2.2 — Configure the AWS CLI</w:t>
+        </w:r>
+      </w:p>
+      <w:p>
+        <w:pPr>
+          <w:spacing w:before="80" w:after="20"/>
+          <w:ind w:left="0"/>
+          <w:tabs>
+            <w:tab w:val="leader" w:leader="dot" w:pos="9000"/>
+          </w:tabs>
+        </w:pPr>
+        <w:r>
+          <w:rPr>
+            <w:rFonts w:ascii="Arial" w:cs="Arial" w:eastAsia="Arial" w:hAnsi="Arial"/>
+            <w:b/>
+            <w:bCs/>
+            <w:color w:val="090B2F"/>
+            <w:sz w:val="22"/>
+            <w:szCs w:val="22"/>
+          </w:rPr>
+          <w:t xml:space="preserve">Phase 3 — Update Hardcoded Values</w:t>
+        </w:r>
+      </w:p>
+      <w:p>
+        <w:pPr>
+          <w:spacing w:before="20" w:after="20"/>
+          <w:ind w:left="360"/>
+          <w:tabs>
+            <w:tab w:val="leader" w:leader="dot" w:pos="9000"/>
+          </w:tabs>
+        </w:pPr>
+        <w:r>
+          <w:rPr>
+            <w:rFonts w:ascii="Arial" w:cs="Arial" w:eastAsia="Arial" w:hAnsi="Arial"/>
+            <w:color w:val="555555"/>
+            <w:sz w:val="20"/>
+            <w:szCs w:val="20"/>
+          </w:rPr>
+          <w:t xml:space="preserve">Step 3.1 — Create the Terraform State Backend</w:t>
+        </w:r>
+      </w:p>
+      <w:p>
+        <w:pPr>
+          <w:spacing w:before="20" w:after="20"/>
+          <w:ind w:left="360"/>
+          <w:tabs>
+            <w:tab w:val="leader" w:leader="dot" w:pos="9000"/>
+          </w:tabs>
+        </w:pPr>
+        <w:r>
+          <w:rPr>
+            <w:rFonts w:ascii="Arial" w:cs="Arial" w:eastAsia="Arial" w:hAnsi="Arial"/>
+            <w:color w:val="555555"/>
+            <w:sz w:val="20"/>
+            <w:szCs w:val="20"/>
+          </w:rPr>
+          <w:t xml:space="preserve">Step 3.2 — Update backend.tf</w:t>
+        </w:r>
+      </w:p>
+      <w:p>
+        <w:pPr>
+          <w:spacing w:before="20" w:after="20"/>
+          <w:ind w:left="360"/>
+          <w:tabs>
+            <w:tab w:val="leader" w:leader="dot" w:pos="9000"/>
+          </w:tabs>
+        </w:pPr>
+        <w:r>
+          <w:rPr>
+            <w:rFonts w:ascii="Arial" w:cs="Arial" w:eastAsia="Arial" w:hAnsi="Arial"/>
+            <w:color w:val="555555"/>
+            <w:sz w:val="20"/>
+            <w:szCs w:val="20"/>
+          </w:rPr>
+          <w:t xml:space="preserve">Step 3.3 — Update main.tf S3 References</w:t>
+        </w:r>
+      </w:p>
+      <w:p>
+        <w:pPr>
+          <w:spacing w:before="20" w:after="20"/>
+          <w:ind w:left="360"/>
+          <w:tabs>
+            <w:tab w:val="leader" w:leader="dot" w:pos="9000"/>
+          </w:tabs>
+        </w:pPr>
+        <w:r>
+          <w:rPr>
+            <w:rFonts w:ascii="Arial" w:cs="Arial" w:eastAsia="Arial" w:hAnsi="Arial"/>
+            <w:color w:val="555555"/>
+            <w:sz w:val="20"/>
+            <w:szCs w:val="20"/>
+          </w:rPr>
+          <w:t xml:space="preserve">Step 3.4 — Commit the Updated Files</w:t>
+        </w:r>
+      </w:p>
+      <w:p>
+        <w:pPr>
+          <w:spacing w:before="80" w:after="20"/>
+          <w:ind w:left="0"/>
+          <w:tabs>
+            <w:tab w:val="leader" w:leader="dot" w:pos="9000"/>
+          </w:tabs>
+        </w:pPr>
+        <w:r>
+          <w:rPr>
+            <w:rFonts w:ascii="Arial" w:cs="Arial" w:eastAsia="Arial" w:hAnsi="Arial"/>
+            <w:b/>
+            <w:bCs/>
+            <w:color w:val="090B2F"/>
+            <w:sz w:val="22"/>
+            <w:szCs w:val="22"/>
+          </w:rPr>
+          <w:t xml:space="preserve">Phase 4 — Store Secrets in SSM</w:t>
+        </w:r>
+      </w:p>
+      <w:p>
+        <w:pPr>
+          <w:spacing w:before="20" w:after="20"/>
+          <w:ind w:left="360"/>
+          <w:tabs>
+            <w:tab w:val="leader" w:leader="dot" w:pos="9000"/>
+          </w:tabs>
+        </w:pPr>
+        <w:r>
+          <w:rPr>
+            <w:rFonts w:ascii="Arial" w:cs="Arial" w:eastAsia="Arial" w:hAnsi="Arial"/>
+            <w:color w:val="555555"/>
+            <w:sz w:val="20"/>
+            <w:szCs w:val="20"/>
+          </w:rPr>
+          <w:t xml:space="preserve">Step 4.1 — Sonatype License</w:t>
+        </w:r>
+      </w:p>
+      <w:p>
+        <w:pPr>
+          <w:spacing w:before="20" w:after="20"/>
+          <w:ind w:left="360"/>
+          <w:tabs>
+            <w:tab w:val="leader" w:leader="dot" w:pos="9000"/>
+          </w:tabs>
+        </w:pPr>
+        <w:r>
+          <w:rPr>
+            <w:rFonts w:ascii="Arial" w:cs="Arial" w:eastAsia="Arial" w:hAnsi="Arial"/>
+            <w:color w:val="555555"/>
+            <w:sz w:val="20"/>
+            <w:szCs w:val="20"/>
+          </w:rPr>
+          <w:t xml:space="preserve">Step 4.2 — Claude API Key</w:t>
+        </w:r>
+      </w:p>
+      <w:p>
+        <w:pPr>
+          <w:spacing w:before="80" w:after="20"/>
+          <w:ind w:left="0"/>
+          <w:tabs>
+            <w:tab w:val="leader" w:leader="dot" w:pos="9000"/>
+          </w:tabs>
+        </w:pPr>
+        <w:r>
+          <w:rPr>
+            <w:rFonts w:ascii="Arial" w:cs="Arial" w:eastAsia="Arial" w:hAnsi="Arial"/>
+            <w:b/>
+            <w:bCs/>
+            <w:color w:val="090B2F"/>
+            <w:sz w:val="22"/>
+            <w:szCs w:val="22"/>
+          </w:rPr>
+          <w:t xml:space="preserve">Phase 5 — Verify SES Sender Domain</w:t>
+        </w:r>
+      </w:p>
+      <w:p>
+        <w:pPr>
+          <w:spacing w:before="20" w:after="20"/>
+          <w:ind w:left="360"/>
+          <w:tabs>
+            <w:tab w:val="leader" w:leader="dot" w:pos="9000"/>
+          </w:tabs>
+        </w:pPr>
+        <w:r>
+          <w:rPr>
+            <w:rFonts w:ascii="Arial" w:cs="Arial" w:eastAsia="Arial" w:hAnsi="Arial"/>
+            <w:color w:val="555555"/>
+            <w:sz w:val="20"/>
+            <w:szCs w:val="20"/>
+          </w:rPr>
+          <w:t xml:space="preserve">Step 5.1 — Verify the Domain in SES</w:t>
+        </w:r>
+      </w:p>
+      <w:p>
+        <w:pPr>
+          <w:spacing w:before="20" w:after="20"/>
+          <w:ind w:left="360"/>
+          <w:tabs>
+            <w:tab w:val="leader" w:leader="dot" w:pos="9000"/>
+          </w:tabs>
+        </w:pPr>
+        <w:r>
+          <w:rPr>
+            <w:rFonts w:ascii="Arial" w:cs="Arial" w:eastAsia="Arial" w:hAnsi="Arial"/>
+            <w:color w:val="555555"/>
+            <w:sz w:val="20"/>
+            <w:szCs w:val="20"/>
+          </w:rPr>
+          <w:t xml:space="preserve">Step 5.2 — Request SES Production Access</w:t>
+        </w:r>
+      </w:p>
+      <w:p>
+        <w:pPr>
+          <w:spacing w:before="80" w:after="20"/>
+          <w:ind w:left="0"/>
+          <w:tabs>
+            <w:tab w:val="leader" w:leader="dot" w:pos="9000"/>
+          </w:tabs>
+        </w:pPr>
+        <w:r>
+          <w:rPr>
+            <w:rFonts w:ascii="Arial" w:cs="Arial" w:eastAsia="Arial" w:hAnsi="Arial"/>
+            <w:b/>
+            <w:bCs/>
+            <w:color w:val="090B2F"/>
+            <w:sz w:val="22"/>
+            <w:szCs w:val="22"/>
+          </w:rPr>
+          <w:t xml:space="preserve">Phase 6 — First Deployment</w:t>
+        </w:r>
+      </w:p>
+      <w:p>
+        <w:pPr>
+          <w:spacing w:before="20" w:after="20"/>
+          <w:ind w:left="360"/>
+          <w:tabs>
+            <w:tab w:val="leader" w:leader="dot" w:pos="9000"/>
+          </w:tabs>
+        </w:pPr>
+        <w:r>
+          <w:rPr>
+            <w:rFonts w:ascii="Arial" w:cs="Arial" w:eastAsia="Arial" w:hAnsi="Arial"/>
+            <w:color w:val="555555"/>
+            <w:sz w:val="20"/>
+            <w:szCs w:val="20"/>
+          </w:rPr>
+          <w:t xml:space="preserve">Step 6.1 — Initialize Terraform</w:t>
+        </w:r>
+      </w:p>
+      <w:p>
+        <w:pPr>
+          <w:spacing w:before="20" w:after="20"/>
+          <w:ind w:left="360"/>
+          <w:tabs>
+            <w:tab w:val="leader" w:leader="dot" w:pos="9000"/>
+          </w:tabs>
+        </w:pPr>
+        <w:r>
+          <w:rPr>
+            <w:rFonts w:ascii="Arial" w:cs="Arial" w:eastAsia="Arial" w:hAnsi="Arial"/>
+            <w:color w:val="555555"/>
+            <w:sz w:val="20"/>
+            <w:szCs w:val="20"/>
+          </w:rPr>
+          <w:t xml:space="preserve">Step 6.2 — Deploy a Test Lab (to Yourself)</w:t>
+        </w:r>
+      </w:p>
+      <w:p>
+        <w:pPr>
+          <w:spacing w:before="20" w:after="20"/>
+          <w:ind w:left="360"/>
+          <w:tabs>
+            <w:tab w:val="leader" w:leader="dot" w:pos="9000"/>
+          </w:tabs>
+        </w:pPr>
+        <w:r>
+          <w:rPr>
+            <w:rFonts w:ascii="Arial" w:cs="Arial" w:eastAsia="Arial" w:hAnsi="Arial"/>
+            <w:color w:val="555555"/>
+            <w:sz w:val="20"/>
+            <w:szCs w:val="20"/>
+          </w:rPr>
+          <w:t xml:space="preserve">Step 6.3 — Validate the Lab</w:t>
+        </w:r>
+      </w:p>
+      <w:p>
+        <w:pPr>
+          <w:spacing w:before="20" w:after="20"/>
+          <w:ind w:left="360"/>
+          <w:tabs>
+            <w:tab w:val="leader" w:leader="dot" w:pos="9000"/>
+          </w:tabs>
+        </w:pPr>
+        <w:r>
+          <w:rPr>
+            <w:rFonts w:ascii="Arial" w:cs="Arial" w:eastAsia="Arial" w:hAnsi="Arial"/>
+            <w:color w:val="555555"/>
+            <w:sz w:val="20"/>
+            <w:szCs w:val="20"/>
+          </w:rPr>
+          <w:t xml:space="preserve">Validating Lambda Functions</w:t>
+        </w:r>
+      </w:p>
+      <w:p>
+        <w:pPr>
+          <w:spacing w:before="80" w:after="20"/>
+          <w:ind w:left="0"/>
+          <w:tabs>
+            <w:tab w:val="leader" w:leader="dot" w:pos="9000"/>
+          </w:tabs>
+        </w:pPr>
+        <w:r>
+          <w:rPr>
+            <w:rFonts w:ascii="Arial" w:cs="Arial" w:eastAsia="Arial" w:hAnsi="Arial"/>
+            <w:b/>
+            <w:bCs/>
+            <w:color w:val="090B2F"/>
+            <w:sz w:val="22"/>
+            <w:szCs w:val="22"/>
+          </w:rPr>
+          <w:t xml:space="preserve">Phase 7 — Ongoing Operations</w:t>
+        </w:r>
+      </w:p>
+      <w:p>
+        <w:pPr>
+          <w:spacing w:before="20" w:after="20"/>
+          <w:ind w:left="360"/>
+          <w:tabs>
+            <w:tab w:val="leader" w:leader="dot" w:pos="9000"/>
+          </w:tabs>
+        </w:pPr>
+        <w:r>
+          <w:rPr>
+            <w:rFonts w:ascii="Arial" w:cs="Arial" w:eastAsia="Arial" w:hAnsi="Arial"/>
+            <w:color w:val="555555"/>
+            <w:sz w:val="20"/>
+            <w:szCs w:val="20"/>
+          </w:rPr>
+          <w:t xml:space="preserve">Deploying a Customer Lab</w:t>
+        </w:r>
+      </w:p>
+      <w:p>
+        <w:pPr>
+          <w:spacing w:before="20" w:after="20"/>
+          <w:ind w:left="360"/>
+          <w:tabs>
+            <w:tab w:val="leader" w:leader="dot" w:pos="9000"/>
+          </w:tabs>
+        </w:pPr>
+        <w:r>
+          <w:rPr>
+            <w:rFonts w:ascii="Arial" w:cs="Arial" w:eastAsia="Arial" w:hAnsi="Arial"/>
+            <w:color w:val="555555"/>
+            <w:sz w:val="20"/>
+            <w:szCs w:val="20"/>
+          </w:rPr>
+          <w:t xml:space="preserve">Deploying a Cohort (Multiple Labs at Once)</w:t>
+        </w:r>
+      </w:p>
+      <w:p>
+        <w:pPr>
+          <w:spacing w:before="20" w:after="20"/>
+          <w:ind w:left="360"/>
+          <w:tabs>
+            <w:tab w:val="leader" w:leader="dot" w:pos="9000"/>
+          </w:tabs>
+        </w:pPr>
+        <w:r>
+          <w:rPr>
+            <w:rFonts w:ascii="Arial" w:cs="Arial" w:eastAsia="Arial" w:hAnsi="Arial"/>
+            <w:color w:val="555555"/>
+            <w:sz w:val="20"/>
+            <w:szCs w:val="20"/>
+          </w:rPr>
+          <w:t xml:space="preserve">Manually Tearing Down a Lab</w:t>
+        </w:r>
+      </w:p>
+      <w:p>
+        <w:pPr>
+          <w:spacing w:before="20" w:after="20"/>
+          <w:ind w:left="360"/>
+          <w:tabs>
+            <w:tab w:val="leader" w:leader="dot" w:pos="9000"/>
+          </w:tabs>
+        </w:pPr>
+        <w:r>
+          <w:rPr>
+            <w:rFonts w:ascii="Arial" w:cs="Arial" w:eastAsia="Arial" w:hAnsi="Arial"/>
+            <w:color w:val="555555"/>
+            <w:sz w:val="20"/>
+            <w:szCs w:val="20"/>
+          </w:rPr>
+          <w:t xml:space="preserve">Viewing Running Labs</w:t>
+        </w:r>
+      </w:p>
+      <w:p>
+        <w:pPr>
+          <w:spacing w:before="20" w:after="20"/>
+          <w:ind w:left="360"/>
+          <w:tabs>
+            <w:tab w:val="leader" w:leader="dot" w:pos="9000"/>
+          </w:tabs>
+        </w:pPr>
+        <w:r>
+          <w:rPr>
+            <w:rFonts w:ascii="Arial" w:cs="Arial" w:eastAsia="Arial" w:hAnsi="Arial"/>
+            <w:color w:val="555555"/>
+            <w:sz w:val="20"/>
+            <w:szCs w:val="20"/>
+          </w:rPr>
+          <w:t xml:space="preserve">Accessing a Running Lab (Sonatype Internal)</w:t>
+        </w:r>
+      </w:p>
+      <w:p>
+        <w:pPr>
+          <w:spacing w:before="20" w:after="20"/>
+          <w:ind w:left="360"/>
+          <w:tabs>
+            <w:tab w:val="leader" w:leader="dot" w:pos="9000"/>
+          </w:tabs>
+        </w:pPr>
+        <w:r>
+          <w:rPr>
+            <w:rFonts w:ascii="Arial" w:cs="Arial" w:eastAsia="Arial" w:hAnsi="Arial"/>
+            <w:color w:val="555555"/>
+            <w:sz w:val="20"/>
+            <w:szCs w:val="20"/>
+          </w:rPr>
+          <w:t xml:space="preserve">Renewing the Sonatype License</w:t>
+        </w:r>
+      </w:p>
+      <w:p>
+        <w:pPr>
+          <w:spacing w:before="20" w:after="20"/>
+          <w:ind w:left="360"/>
+          <w:tabs>
+            <w:tab w:val="leader" w:leader="dot" w:pos="9000"/>
+          </w:tabs>
+        </w:pPr>
+        <w:r>
+          <w:rPr>
+            <w:rFonts w:ascii="Arial" w:cs="Arial" w:eastAsia="Arial" w:hAnsi="Arial"/>
+            <w:color w:val="555555"/>
+            <w:sz w:val="20"/>
+            <w:szCs w:val="20"/>
+          </w:rPr>
+          <w:t xml:space="preserve">Cost Estimates</w:t>
+        </w:r>
+      </w:p>
+      <w:p>
+        <w:pPr>
+          <w:spacing w:before="80" w:after="20"/>
+          <w:ind w:left="0"/>
+          <w:tabs>
+            <w:tab w:val="leader" w:leader="dot" w:pos="9000"/>
+          </w:tabs>
+        </w:pPr>
+        <w:r>
+          <w:rPr>
+            <w:rFonts w:ascii="Arial" w:cs="Arial" w:eastAsia="Arial" w:hAnsi="Arial"/>
+            <w:b/>
+            <w:bCs/>
+            <w:color w:val="090B2F"/>
+            <w:sz w:val="22"/>
+            <w:szCs w:val="22"/>
+          </w:rPr>
+          <w:t xml:space="preserve">Phase 8 — Decommission Kimberly’s Setup</w:t>
+        </w:r>
+      </w:p>
+      <w:p>
+        <w:pPr>
+          <w:spacing w:before="20" w:after="20"/>
+          <w:ind w:left="360"/>
+          <w:tabs>
+            <w:tab w:val="leader" w:leader="dot" w:pos="9000"/>
+          </w:tabs>
+        </w:pPr>
+        <w:r>
+          <w:rPr>
+            <w:rFonts w:ascii="Arial" w:cs="Arial" w:eastAsia="Arial" w:hAnsi="Arial"/>
+            <w:color w:val="555555"/>
+            <w:sz w:val="20"/>
+            <w:szCs w:val="20"/>
+          </w:rPr>
+          <w:t xml:space="preserve">Coordinate with Kimberly Before Proceeding</w:t>
+        </w:r>
+      </w:p>
+      <w:p>
+        <w:pPr>
+          <w:spacing w:before="20" w:after="20"/>
+          <w:ind w:left="360"/>
+          <w:tabs>
+            <w:tab w:val="leader" w:leader="dot" w:pos="9000"/>
+          </w:tabs>
+        </w:pPr>
+        <w:r>
+          <w:rPr>
+            <w:rFonts w:ascii="Arial" w:cs="Arial" w:eastAsia="Arial" w:hAnsi="Arial"/>
+            <w:color w:val="555555"/>
+            <w:sz w:val="20"/>
+            <w:szCs w:val="20"/>
+          </w:rPr>
+          <w:t xml:space="preserve">What to Decommission</w:t>
+        </w:r>
+      </w:p>
+      <w:p>
+        <w:pPr>
+          <w:spacing w:before="80" w:after="20"/>
+          <w:ind w:left="0"/>
+          <w:tabs>
+            <w:tab w:val="leader" w:leader="dot" w:pos="9000"/>
+          </w:tabs>
+        </w:pPr>
+        <w:r>
+          <w:rPr>
+            <w:rFonts w:ascii="Arial" w:cs="Arial" w:eastAsia="Arial" w:hAnsi="Arial"/>
+            <w:b/>
+            <w:bCs/>
+            <w:color w:val="090B2F"/>
+            <w:sz w:val="22"/>
+            <w:szCs w:val="22"/>
+          </w:rPr>
+          <w:t xml:space="preserve">Troubleshooting</w:t>
+        </w:r>
+      </w:p>
+      <w:p>
+        <w:pPr>
+          <w:spacing w:before="20" w:after="20"/>
+          <w:ind w:left="360"/>
+          <w:tabs>
+            <w:tab w:val="leader" w:leader="dot" w:pos="9000"/>
+          </w:tabs>
+        </w:pPr>
+        <w:r>
+          <w:rPr>
+            <w:rFonts w:ascii="Arial" w:cs="Arial" w:eastAsia="Arial" w:hAnsi="Arial"/>
+            <w:color w:val="555555"/>
+            <w:sz w:val="20"/>
+            <w:szCs w:val="20"/>
+          </w:rPr>
+          <w:t xml:space="preserve">Lab boots but products are not reachable</w:t>
+        </w:r>
+      </w:p>
+      <w:p>
+        <w:pPr>
+          <w:spacing w:before="20" w:after="20"/>
+          <w:ind w:left="360"/>
+          <w:tabs>
+            <w:tab w:val="leader" w:leader="dot" w:pos="9000"/>
+          </w:tabs>
+        </w:pPr>
+        <w:r>
+          <w:rPr>
+            <w:rFonts w:ascii="Arial" w:cs="Arial" w:eastAsia="Arial" w:hAnsi="Arial"/>
+            <w:color w:val="555555"/>
+            <w:sz w:val="20"/>
+            <w:szCs w:val="20"/>
+          </w:rPr>
+          <w:t xml:space="preserve">Lab Tutor returns ‘tutor is not available’</w:t>
+        </w:r>
+      </w:p>
+      <w:p>
+        <w:pPr>
+          <w:spacing w:before="20" w:after="20"/>
+          <w:ind w:left="360"/>
+          <w:tabs>
+            <w:tab w:val="leader" w:leader="dot" w:pos="9000"/>
+          </w:tabs>
+        </w:pPr>
+        <w:r>
+          <w:rPr>
+            <w:rFonts w:ascii="Arial" w:cs="Arial" w:eastAsia="Arial" w:hAnsi="Arial"/>
+            <w:color w:val="555555"/>
+            <w:sz w:val="20"/>
+            <w:szCs w:val="20"/>
+          </w:rPr>
+          <w:t xml:space="preserve">SES email not received</w:t>
+        </w:r>
+      </w:p>
+      <w:p>
+        <w:pPr>
+          <w:spacing w:before="20" w:after="20"/>
+          <w:ind w:left="360"/>
+          <w:tabs>
+            <w:tab w:val="leader" w:leader="dot" w:pos="9000"/>
+          </w:tabs>
+        </w:pPr>
+        <w:r>
+          <w:rPr>
+            <w:rFonts w:ascii="Arial" w:cs="Arial" w:eastAsia="Arial" w:hAnsi="Arial"/>
+            <w:color w:val="555555"/>
+            <w:sz w:val="20"/>
+            <w:szCs w:val="20"/>
+          </w:rPr>
+          <w:t xml:space="preserve">Terraform init fails with backend error</w:t>
+        </w:r>
+      </w:p>
+      <w:p>
+        <w:pPr>
+          <w:spacing w:before="20" w:after="20"/>
+          <w:ind w:left="360"/>
+          <w:tabs>
+            <w:tab w:val="leader" w:leader="dot" w:pos="9000"/>
+          </w:tabs>
+        </w:pPr>
+        <w:r>
+          <w:rPr>
+            <w:rFonts w:ascii="Arial" w:cs="Arial" w:eastAsia="Arial" w:hAnsi="Arial"/>
+            <w:color w:val="555555"/>
+            <w:sz w:val="20"/>
+            <w:szCs w:val="20"/>
+          </w:rPr>
+          <w:t xml:space="preserve">Known Issues</w:t>
+        </w:r>
+      </w:p>
+      <w:p>
+        <w:pPr>
+          <w:spacing w:before="80" w:after="20"/>
+          <w:ind w:left="0"/>
+          <w:tabs>
+            <w:tab w:val="leader" w:leader="dot" w:pos="9000"/>
+          </w:tabs>
+        </w:pPr>
+        <w:r>
+          <w:rPr>
+            <w:rFonts w:ascii="Arial" w:cs="Arial" w:eastAsia="Arial" w:hAnsi="Arial"/>
+            <w:b/>
+            <w:bCs/>
+            <w:color w:val="090B2F"/>
+            <w:sz w:val="22"/>
+            <w:szCs w:val="22"/>
+          </w:rPr>
+          <w:t xml:space="preserve">Security Notes</w:t>
+        </w:r>
+      </w:p>
+      <w:p>
+        <w:pPr>
+          <w:spacing w:before="80" w:after="20"/>
+          <w:ind w:left="0"/>
+          <w:tabs>
+            <w:tab w:val="leader" w:leader="dot" w:pos="9000"/>
+          </w:tabs>
+        </w:pPr>
+        <w:r>
+          <w:rPr>
+            <w:rFonts w:ascii="Arial" w:cs="Arial" w:eastAsia="Arial" w:hAnsi="Arial"/>
+            <w:b/>
+            <w:bCs/>
+            <w:color w:val="090B2F"/>
+            <w:sz w:val="22"/>
+            <w:szCs w:val="22"/>
+          </w:rPr>
+          <w:t xml:space="preserve">Quick Reference — Day-to-Day Commands</w:t>
+        </w:r>
+      </w:p>
+      <w:p>
+        <w:pPr>
+          <w:spacing w:before="20" w:after="20"/>
+          <w:ind w:left="360"/>
+          <w:tabs>
+            <w:tab w:val="leader" w:leader="dot" w:pos="9000"/>
+          </w:tabs>
+        </w:pPr>
+        <w:r>
+          <w:rPr>
+            <w:rFonts w:ascii="Arial" w:cs="Arial" w:eastAsia="Arial" w:hAnsi="Arial"/>
+            <w:color w:val="555555"/>
+            <w:sz w:val="20"/>
+            <w:szCs w:val="20"/>
+          </w:rPr>
+          <w:t xml:space="preserve">Deploy a Single Lab</w:t>
+        </w:r>
+      </w:p>
+      <w:p>
+        <w:pPr>
+          <w:spacing w:before="20" w:after="20"/>
+          <w:ind w:left="360"/>
+          <w:tabs>
+            <w:tab w:val="leader" w:leader="dot" w:pos="9000"/>
+          </w:tabs>
+        </w:pPr>
+        <w:r>
+          <w:rPr>
+            <w:rFonts w:ascii="Arial" w:cs="Arial" w:eastAsia="Arial" w:hAnsi="Arial"/>
+            <w:color w:val="555555"/>
+            <w:sz w:val="20"/>
+            <w:szCs w:val="20"/>
+          </w:rPr>
+          <w:t xml:space="preserve">Deploy a Cohort</w:t>
+        </w:r>
+      </w:p>
+      <w:p>
+        <w:pPr>
+          <w:spacing w:before="20" w:after="20"/>
+          <w:ind w:left="360"/>
+          <w:tabs>
+            <w:tab w:val="leader" w:leader="dot" w:pos="9000"/>
+          </w:tabs>
+        </w:pPr>
+        <w:r>
+          <w:rPr>
+            <w:rFonts w:ascii="Arial" w:cs="Arial" w:eastAsia="Arial" w:hAnsi="Arial"/>
+            <w:color w:val="555555"/>
+            <w:sz w:val="20"/>
+            <w:szCs w:val="20"/>
+          </w:rPr>
+          <w:t xml:space="preserve">Destroy All Labs</w:t>
+        </w:r>
+      </w:p>
+      <w:p>
+        <w:pPr>
+          <w:spacing w:before="20" w:after="20"/>
+          <w:ind w:left="360"/>
+          <w:tabs>
+            <w:tab w:val="leader" w:leader="dot" w:pos="9000"/>
+          </w:tabs>
+        </w:pPr>
+        <w:r>
+          <w:rPr>
+            <w:rFonts w:ascii="Arial" w:cs="Arial" w:eastAsia="Arial" w:hAnsi="Arial"/>
+            <w:color w:val="555555"/>
+            <w:sz w:val="20"/>
+            <w:szCs w:val="20"/>
+          </w:rPr>
+          <w:t xml:space="preserve">Connect to a Running Instance</w:t>
+        </w:r>
+      </w:p>
+      <w:p>
+        <w:pPr>
+          <w:spacing w:before="20" w:after="20"/>
+          <w:ind w:left="360"/>
+          <w:tabs>
+            <w:tab w:val="leader" w:leader="dot" w:pos="9000"/>
+          </w:tabs>
+        </w:pPr>
+        <w:r>
+          <w:rPr>
+            <w:rFonts w:ascii="Arial" w:cs="Arial" w:eastAsia="Arial" w:hAnsi="Arial"/>
+            <w:color w:val="555555"/>
+            <w:sz w:val="20"/>
+            <w:szCs w:val="20"/>
+          </w:rPr>
+          <w:t xml:space="preserve">View Running Labs</w:t>
+        </w:r>
+      </w:p>
+      <w:p>
+        <w:pPr>
+          <w:spacing w:before="20" w:after="20"/>
+          <w:ind w:left="360"/>
+          <w:tabs>
+            <w:tab w:val="leader" w:leader="dot" w:pos="9000"/>
+          </w:tabs>
+        </w:pPr>
+        <w:r>
+          <w:rPr>
+            <w:rFonts w:ascii="Arial" w:cs="Arial" w:eastAsia="Arial" w:hAnsi="Arial"/>
+            <w:color w:val="555555"/>
+            <w:sz w:val="20"/>
+            <w:szCs w:val="20"/>
+          </w:rPr>
+          <w:t xml:space="preserve">Rotate Claude API Key</w:t>
+        </w:r>
+      </w:p>
+      <w:p>
+        <w:pPr>
+          <w:spacing w:before="20" w:after="20"/>
+          <w:ind w:left="360"/>
+          <w:tabs>
+            <w:tab w:val="leader" w:leader="dot" w:pos="9000"/>
+          </w:tabs>
+        </w:pPr>
+        <w:r>
+          <w:rPr>
+            <w:rFonts w:ascii="Arial" w:cs="Arial" w:eastAsia="Arial" w:hAnsi="Arial"/>
+            <w:color w:val="555555"/>
+            <w:sz w:val="20"/>
+            <w:szCs w:val="20"/>
+          </w:rPr>
+          <w:t xml:space="preserve">Renew Sonatype License</w:t>
+        </w:r>
+      </w:p>
+      <w:p>
+        <w:pPr>
+          <w:spacing w:before="20" w:after="20"/>
+          <w:ind w:left="360"/>
+          <w:tabs>
+            <w:tab w:val="leader" w:leader="dot" w:pos="9000"/>
+          </w:tabs>
+        </w:pPr>
+        <w:r>
+          <w:rPr>
+            <w:rFonts w:ascii="Arial" w:cs="Arial" w:eastAsia="Arial" w:hAnsi="Arial"/>
+            <w:color w:val="555555"/>
+            <w:sz w:val="20"/>
+            <w:szCs w:val="20"/>
+          </w:rPr>
+          <w:t xml:space="preserve">Invoke Lambda Manually (Testing)</w:t>
+        </w:r>
+      </w:p>
       <w:r>
         <w:fldChar w:fldCharType="end"/>
       </w:r>

</xml_diff>